<commit_message>
docs: actualizar version final de informes, diapositivas y arquitectura para los 4 integrantes (Paul Ferrada, Agustin Cañas, Fabian Mora y Felipe Labarca)
</commit_message>
<xml_diff>
--- a/Informe_Tecnico_Azure_IIS_MVP.docx
+++ b/Informe_Tecnico_Azure_IIS_MVP.docx
@@ -6,7 +6,7 @@
       <w:pPr>
         <w:shd w:val="clear" w:color="auto" w:fill="F8FAFC"/>
         <w:jc w:val="center"/>
-        <w:divId w:val="1450469637"/>
+        <w:divId w:val="1168129663"/>
         <w:rPr>
           <w:rFonts w:ascii="Segoe UI" w:eastAsia="Times New Roman" w:hAnsi="Segoe UI" w:cs="Segoe UI"/>
           <w:b/>
@@ -38,7 +38,7 @@
         <w:spacing w:before="360" w:after="75"/>
         <w:jc w:val="center"/>
         <w:outlineLvl w:val="1"/>
-        <w:divId w:val="1168714234"/>
+        <w:divId w:val="1886287518"/>
         <w:rPr>
           <w:rFonts w:ascii="Segoe UI" w:eastAsia="Times New Roman" w:hAnsi="Segoe UI" w:cs="Segoe UI"/>
           <w:b/>
@@ -70,7 +70,7 @@
       <w:pPr>
         <w:shd w:val="clear" w:color="auto" w:fill="F8FAFC"/>
         <w:jc w:val="center"/>
-        <w:divId w:val="2041275770"/>
+        <w:divId w:val="391077825"/>
         <w:rPr>
           <w:rFonts w:ascii="Segoe UI" w:eastAsia="Times New Roman" w:hAnsi="Segoe UI" w:cs="Segoe UI"/>
           <w:b/>
@@ -111,7 +111,7 @@
       <w:pPr>
         <w:pStyle w:val="NormalWeb"/>
         <w:shd w:val="clear" w:color="auto" w:fill="F8FAFC"/>
-        <w:divId w:val="579366945"/>
+        <w:divId w:val="98723203"/>
         <w:rPr>
           <w:rFonts w:ascii="Segoe UI" w:hAnsi="Segoe UI" w:cs="Segoe UI"/>
           <w:color w:val="475569"/>
@@ -146,7 +146,7 @@
       <w:pPr>
         <w:pStyle w:val="NormalWeb"/>
         <w:shd w:val="clear" w:color="auto" w:fill="F8FAFC"/>
-        <w:divId w:val="579366945"/>
+        <w:divId w:val="98723203"/>
         <w:rPr>
           <w:rFonts w:ascii="Segoe UI" w:hAnsi="Segoe UI" w:cs="Segoe UI"/>
           <w:color w:val="475569"/>
@@ -181,7 +181,7 @@
       <w:pPr>
         <w:pStyle w:val="NormalWeb"/>
         <w:shd w:val="clear" w:color="auto" w:fill="F8FAFC"/>
-        <w:divId w:val="579366945"/>
+        <w:divId w:val="98723203"/>
         <w:rPr>
           <w:rFonts w:ascii="Segoe UI" w:hAnsi="Segoe UI" w:cs="Segoe UI"/>
           <w:color w:val="475569"/>
@@ -216,7 +216,7 @@
       <w:pPr>
         <w:pStyle w:val="NormalWeb"/>
         <w:shd w:val="clear" w:color="auto" w:fill="F8FAFC"/>
-        <w:divId w:val="579366945"/>
+        <w:divId w:val="98723203"/>
         <w:rPr>
           <w:rFonts w:ascii="Segoe UI" w:hAnsi="Segoe UI" w:cs="Segoe UI"/>
           <w:color w:val="475569"/>
@@ -251,7 +251,7 @@
       <w:pPr>
         <w:pStyle w:val="NormalWeb"/>
         <w:shd w:val="clear" w:color="auto" w:fill="F8FAFC"/>
-        <w:divId w:val="579366945"/>
+        <w:divId w:val="98723203"/>
         <w:rPr>
           <w:rFonts w:ascii="Segoe UI" w:hAnsi="Segoe UI" w:cs="Segoe UI"/>
           <w:color w:val="475569"/>
@@ -279,13 +279,13 @@
           <w:szCs w:val="20"/>
           <w:lang w:val="es-ES"/>
         </w:rPr>
-        <w:t xml:space="preserve"> http://aurasmartparking.eastus.cloudapp.azure.com</w:t>
+        <w:t xml:space="preserve"> http://puntoalerce.chilecentral.cloudapp.azure.com</w:t>
       </w:r>
     </w:p>
     <w:p>
       <w:pPr>
         <w:pStyle w:val="Ttulo2"/>
-        <w:divId w:val="97339320"/>
+        <w:divId w:val="309755264"/>
         <w:rPr>
           <w:rFonts w:ascii="Segoe UI" w:eastAsia="Times New Roman" w:hAnsi="Segoe UI" w:cs="Segoe UI"/>
           <w:lang w:val="es-ES"/>
@@ -317,7 +317,7 @@
       </w:tblGrid>
       <w:tr>
         <w:trPr>
-          <w:divId w:val="97339320"/>
+          <w:divId w:val="309755264"/>
           <w:tblHeader/>
         </w:trPr>
         <w:tc>
@@ -455,7 +455,7 @@
       </w:tr>
       <w:tr>
         <w:trPr>
-          <w:divId w:val="97339320"/>
+          <w:divId w:val="309755264"/>
         </w:trPr>
         <w:tc>
           <w:tcPr>
@@ -492,7 +492,7 @@
                 <w:sz w:val="20"/>
                 <w:szCs w:val="20"/>
               </w:rPr>
-              <w:t>Integrante 1</w:t>
+              <w:t>Fabián Mora</w:t>
             </w:r>
           </w:p>
         </w:tc>
@@ -575,7 +575,7 @@
       </w:tr>
       <w:tr>
         <w:trPr>
-          <w:divId w:val="97339320"/>
+          <w:divId w:val="309755264"/>
         </w:trPr>
         <w:tc>
           <w:tcPr>
@@ -613,7 +613,7 @@
                 <w:szCs w:val="20"/>
               </w:rPr>
               <w:lastRenderedPageBreak/>
-              <w:t>Integrante 2</w:t>
+              <w:t>Agustín Cañas</w:t>
             </w:r>
           </w:p>
         </w:tc>
@@ -696,7 +696,7 @@
       </w:tr>
       <w:tr>
         <w:trPr>
-          <w:divId w:val="97339320"/>
+          <w:divId w:val="309755264"/>
         </w:trPr>
         <w:tc>
           <w:tcPr>
@@ -733,7 +733,7 @@
                 <w:sz w:val="20"/>
                 <w:szCs w:val="20"/>
               </w:rPr>
-              <w:t>Integrante 3</w:t>
+              <w:t>Paul Ferrada</w:t>
             </w:r>
           </w:p>
         </w:tc>
@@ -771,7 +771,7 @@
                 <w:sz w:val="20"/>
                 <w:szCs w:val="20"/>
               </w:rPr>
-              <w:t>Datos e Integración IoT (Hardware)</w:t>
+              <w:t>Infraestructura Cloud y DevOps (Azure)</w:t>
             </w:r>
           </w:p>
         </w:tc>
@@ -809,14 +809,14 @@
                 <w:sz w:val="20"/>
                 <w:szCs w:val="20"/>
               </w:rPr>
-              <w:t>Programación en C++ de Arduino UNO R3, sensores ultrasónicos HC-SR04, servomotores SG90, LCD I2C y puente Web Serial API.</w:t>
+              <w:t>Aprovisionamiento de la VM Windows Server 2022 en Chile Central, configuración del servidor web IIS 10.0 en puerto 80, reglas de seguridad en NSG y Azure DNS.</w:t>
             </w:r>
           </w:p>
         </w:tc>
       </w:tr>
       <w:tr>
         <w:trPr>
-          <w:divId w:val="97339320"/>
+          <w:divId w:val="309755264"/>
         </w:trPr>
         <w:tc>
           <w:tcPr>
@@ -853,7 +853,7 @@
                 <w:sz w:val="20"/>
                 <w:szCs w:val="20"/>
               </w:rPr>
-              <w:t>Integrante 4</w:t>
+              <w:t>Felipe Labarca</w:t>
             </w:r>
           </w:p>
         </w:tc>
@@ -891,7 +891,7 @@
                 <w:sz w:val="20"/>
                 <w:szCs w:val="20"/>
               </w:rPr>
-              <w:t>Infraestructura Cloud y Operaciones</w:t>
+              <w:t>Seguridad, JWT y Persistencia Cloud</w:t>
             </w:r>
           </w:p>
         </w:tc>
@@ -929,7 +929,7 @@
                 <w:sz w:val="20"/>
                 <w:szCs w:val="20"/>
               </w:rPr>
-              <w:t>Aprovisionamiento de la VM en Azure, endurecimiento de seguridad en NSG, instalación y configuración del rol IIS y Azure DNS.</w:t>
+              <w:t>Sistema de autenticación y roles RBAC (Usuario Normal vs Admin), protección criptográfica con Tokens JWT (RFC 7519), integración de Firebase Firestore y consola de auditoría.</w:t>
             </w:r>
           </w:p>
         </w:tc>
@@ -938,7 +938,7 @@
     <w:p>
       <w:pPr>
         <w:pStyle w:val="Ttulo2"/>
-        <w:divId w:val="97339320"/>
+        <w:divId w:val="309755264"/>
         <w:rPr>
           <w:rFonts w:ascii="Segoe UI" w:eastAsia="Times New Roman" w:hAnsi="Segoe UI" w:cs="Segoe UI"/>
           <w:lang w:val="es-ES"/>
@@ -955,7 +955,7 @@
     <w:p>
       <w:pPr>
         <w:pStyle w:val="NormalWeb"/>
-        <w:divId w:val="97339320"/>
+        <w:divId w:val="309755264"/>
         <w:rPr>
           <w:rFonts w:ascii="Segoe UI" w:hAnsi="Segoe UI" w:cs="Segoe UI"/>
           <w:color w:val="1E293B"/>
@@ -1035,7 +1035,17 @@
           <w:szCs w:val="22"/>
           <w:lang w:val="es-ES"/>
         </w:rPr>
-        <w:t xml:space="preserve"> administrado mediante el servidor web </w:t>
+        <w:t xml:space="preserve"> </w:t>
+      </w:r>
+      <w:r>
+        <w:rPr>
+          <w:rFonts w:ascii="Segoe UI" w:hAnsi="Segoe UI" w:cs="Segoe UI"/>
+          <w:color w:val="1E293B"/>
+          <w:sz w:val="22"/>
+          <w:szCs w:val="22"/>
+          <w:lang w:val="es-ES"/>
+        </w:rPr>
+        <w:t xml:space="preserve">administrado mediante el servidor web </w:t>
       </w:r>
       <w:r>
         <w:rPr>
@@ -1062,7 +1072,7 @@
     <w:p>
       <w:pPr>
         <w:pStyle w:val="NormalWeb"/>
-        <w:divId w:val="97339320"/>
+        <w:divId w:val="309755264"/>
         <w:rPr>
           <w:rFonts w:ascii="Segoe UI" w:hAnsi="Segoe UI" w:cs="Segoe UI"/>
           <w:color w:val="1E293B"/>
@@ -1127,7 +1137,7 @@
     <w:p>
       <w:pPr>
         <w:pStyle w:val="Ttulo2"/>
-        <w:divId w:val="97339320"/>
+        <w:divId w:val="309755264"/>
         <w:rPr>
           <w:rFonts w:ascii="Segoe UI" w:eastAsia="Times New Roman" w:hAnsi="Segoe UI" w:cs="Segoe UI"/>
           <w:lang w:val="es-ES"/>
@@ -1144,25 +1154,15 @@
     <w:p>
       <w:pPr>
         <w:pStyle w:val="NormalWeb"/>
-        <w:divId w:val="97339320"/>
-        <w:rPr>
-          <w:rFonts w:ascii="Segoe UI" w:hAnsi="Segoe UI" w:cs="Segoe UI"/>
-          <w:color w:val="1E293B"/>
-          <w:sz w:val="22"/>
-          <w:szCs w:val="22"/>
-          <w:lang w:val="es-ES"/>
-        </w:rPr>
-      </w:pPr>
-      <w:r>
-        <w:rPr>
-          <w:rFonts w:ascii="Segoe UI" w:hAnsi="Segoe UI" w:cs="Segoe UI"/>
-          <w:color w:val="1E293B"/>
-          <w:sz w:val="22"/>
-          <w:szCs w:val="22"/>
-          <w:lang w:val="es-ES"/>
-        </w:rPr>
-        <w:t xml:space="preserve">Para garantizar el aislamiento de procesos y el control exhaustivo sobre el servidor web, los puertos de red y el runtime de ejecución, se aprovisionó una </w:t>
-      </w:r>
+        <w:divId w:val="309755264"/>
+        <w:rPr>
+          <w:rFonts w:ascii="Segoe UI" w:hAnsi="Segoe UI" w:cs="Segoe UI"/>
+          <w:color w:val="1E293B"/>
+          <w:sz w:val="22"/>
+          <w:szCs w:val="22"/>
+          <w:lang w:val="es-ES"/>
+        </w:rPr>
+      </w:pPr>
       <w:r>
         <w:rPr>
           <w:rFonts w:ascii="Segoe UI" w:hAnsi="Segoe UI" w:cs="Segoe UI"/>
@@ -1172,13 +1172,13 @@
           <w:lang w:val="es-ES"/>
         </w:rPr>
         <w:lastRenderedPageBreak/>
-        <w:t xml:space="preserve">máquina virtual bajo el modelo IaaS (Infraestructura como Servicio) en Microsoft Azure. </w:t>
+        <w:t xml:space="preserve">Para garantizar el aislamiento de procesos y el control exhaustivo sobre el servidor web, los puertos de red y el runtime de ejecución, se aprovisionó una máquina virtual bajo el modelo IaaS (Infraestructura como Servicio) en Microsoft Azure. </w:t>
       </w:r>
     </w:p>
     <w:p>
       <w:pPr>
         <w:pStyle w:val="Ttulo3"/>
-        <w:divId w:val="97339320"/>
+        <w:divId w:val="309755264"/>
         <w:rPr>
           <w:rFonts w:ascii="Segoe UI" w:eastAsia="Times New Roman" w:hAnsi="Segoe UI" w:cs="Segoe UI"/>
           <w:lang w:val="es-ES"/>
@@ -1199,7 +1199,7 @@
           <w:numId w:val="1"/>
         </w:numPr>
         <w:spacing w:before="100" w:beforeAutospacing="1" w:after="60"/>
-        <w:divId w:val="97339320"/>
+        <w:divId w:val="309755264"/>
         <w:rPr>
           <w:rFonts w:ascii="Segoe UI" w:eastAsia="Times New Roman" w:hAnsi="Segoe UI" w:cs="Segoe UI"/>
           <w:color w:val="1E293B"/>
@@ -1244,7 +1244,7 @@
           <w:numId w:val="1"/>
         </w:numPr>
         <w:spacing w:before="100" w:beforeAutospacing="1" w:after="60"/>
-        <w:divId w:val="97339320"/>
+        <w:divId w:val="309755264"/>
         <w:rPr>
           <w:rFonts w:ascii="Segoe UI" w:eastAsia="Times New Roman" w:hAnsi="Segoe UI" w:cs="Segoe UI"/>
           <w:color w:val="1E293B"/>
@@ -1289,7 +1289,7 @@
           <w:numId w:val="1"/>
         </w:numPr>
         <w:spacing w:before="100" w:beforeAutospacing="1" w:after="60"/>
-        <w:divId w:val="97339320"/>
+        <w:divId w:val="309755264"/>
         <w:rPr>
           <w:rFonts w:ascii="Segoe UI" w:eastAsia="Times New Roman" w:hAnsi="Segoe UI" w:cs="Segoe UI"/>
           <w:color w:val="1E293B"/>
@@ -1324,17 +1324,17 @@
           <w:rStyle w:val="CdigoHTML"/>
           <w:lang w:val="es-ES"/>
         </w:rPr>
-        <w:t>East US 2</w:t>
-      </w:r>
-      <w:r>
-        <w:rPr>
-          <w:rFonts w:ascii="Segoe UI" w:eastAsia="Times New Roman" w:hAnsi="Segoe UI" w:cs="Segoe UI"/>
-          <w:color w:val="1E293B"/>
-          <w:sz w:val="22"/>
-          <w:szCs w:val="22"/>
-          <w:lang w:val="es-ES"/>
-        </w:rPr>
-        <w:t xml:space="preserve"> (Estados Unidos Oriental 2)</w:t>
+        <w:t>Chile Central</w:t>
+      </w:r>
+      <w:r>
+        <w:rPr>
+          <w:rFonts w:ascii="Segoe UI" w:eastAsia="Times New Roman" w:hAnsi="Segoe UI" w:cs="Segoe UI"/>
+          <w:color w:val="1E293B"/>
+          <w:sz w:val="22"/>
+          <w:szCs w:val="22"/>
+          <w:lang w:val="es-ES"/>
+        </w:rPr>
+        <w:t xml:space="preserve"> (Santiago de Chile)</w:t>
       </w:r>
     </w:p>
     <w:p>
@@ -1344,7 +1344,7 @@
           <w:numId w:val="1"/>
         </w:numPr>
         <w:spacing w:before="100" w:beforeAutospacing="1" w:after="60"/>
-        <w:divId w:val="97339320"/>
+        <w:divId w:val="309755264"/>
         <w:rPr>
           <w:rFonts w:ascii="Segoe UI" w:eastAsia="Times New Roman" w:hAnsi="Segoe UI" w:cs="Segoe UI"/>
           <w:color w:val="1E293B"/>
@@ -1392,7 +1392,7 @@
           <w:numId w:val="1"/>
         </w:numPr>
         <w:spacing w:before="100" w:beforeAutospacing="1" w:after="60"/>
-        <w:divId w:val="97339320"/>
+        <w:divId w:val="309755264"/>
         <w:rPr>
           <w:rFonts w:ascii="Segoe UI" w:eastAsia="Times New Roman" w:hAnsi="Segoe UI" w:cs="Segoe UI"/>
           <w:color w:val="1E293B"/>
@@ -1447,7 +1447,7 @@
           <w:numId w:val="1"/>
         </w:numPr>
         <w:spacing w:before="100" w:beforeAutospacing="1" w:after="60"/>
-        <w:divId w:val="97339320"/>
+        <w:divId w:val="309755264"/>
         <w:rPr>
           <w:rFonts w:ascii="Segoe UI" w:eastAsia="Times New Roman" w:hAnsi="Segoe UI" w:cs="Segoe UI"/>
           <w:color w:val="1E293B"/>
@@ -1485,7 +1485,7 @@
           <w:numId w:val="1"/>
         </w:numPr>
         <w:spacing w:before="100" w:beforeAutospacing="1" w:after="60"/>
-        <w:divId w:val="97339320"/>
+        <w:divId w:val="309755264"/>
         <w:rPr>
           <w:rFonts w:ascii="Segoe UI" w:eastAsia="Times New Roman" w:hAnsi="Segoe UI" w:cs="Segoe UI"/>
           <w:color w:val="1E293B"/>
@@ -1523,7 +1523,7 @@
           <w:numId w:val="1"/>
         </w:numPr>
         <w:spacing w:before="100" w:beforeAutospacing="1" w:after="60"/>
-        <w:divId w:val="97339320"/>
+        <w:divId w:val="309755264"/>
         <w:rPr>
           <w:rFonts w:ascii="Segoe UI" w:eastAsia="Times New Roman" w:hAnsi="Segoe UI" w:cs="Segoe UI"/>
           <w:color w:val="1E293B"/>
@@ -1558,7 +1558,7 @@
       <w:pPr>
         <w:shd w:val="clear" w:color="auto" w:fill="F0F9FF"/>
         <w:jc w:val="center"/>
-        <w:divId w:val="183828882"/>
+        <w:divId w:val="899055496"/>
         <w:rPr>
           <w:rFonts w:ascii="Segoe UI" w:eastAsia="Times New Roman" w:hAnsi="Segoe UI" w:cs="Segoe UI"/>
           <w:b/>
@@ -1584,7 +1584,7 @@
     </w:p>
     <w:p>
       <w:pPr>
-        <w:divId w:val="97339320"/>
+        <w:divId w:val="309755264"/>
         <w:rPr>
           <w:rFonts w:ascii="Segoe UI" w:eastAsia="Times New Roman" w:hAnsi="Segoe UI" w:cs="Segoe UI"/>
           <w:color w:val="1E293B"/>
@@ -1615,7 +1615,7 @@
     <w:p>
       <w:pPr>
         <w:pStyle w:val="Ttulo2"/>
-        <w:divId w:val="97339320"/>
+        <w:divId w:val="309755264"/>
         <w:rPr>
           <w:rFonts w:ascii="Segoe UI" w:eastAsia="Times New Roman" w:hAnsi="Segoe UI" w:cs="Segoe UI"/>
           <w:lang w:val="es-ES"/>
@@ -1632,7 +1632,7 @@
     <w:p>
       <w:pPr>
         <w:pStyle w:val="NormalWeb"/>
-        <w:divId w:val="97339320"/>
+        <w:divId w:val="309755264"/>
         <w:rPr>
           <w:rFonts w:ascii="Segoe UI" w:hAnsi="Segoe UI" w:cs="Segoe UI"/>
           <w:color w:val="1E293B"/>
@@ -1655,7 +1655,7 @@
     <w:p>
       <w:pPr>
         <w:pStyle w:val="Ttulo3"/>
-        <w:divId w:val="97339320"/>
+        <w:divId w:val="309755264"/>
         <w:rPr>
           <w:rFonts w:ascii="Segoe UI" w:eastAsia="Times New Roman" w:hAnsi="Segoe UI" w:cs="Segoe UI"/>
           <w:lang w:val="es-ES"/>
@@ -1676,7 +1676,7 @@
           <w:numId w:val="2"/>
         </w:numPr>
         <w:spacing w:before="100" w:beforeAutospacing="1" w:after="60"/>
-        <w:divId w:val="97339320"/>
+        <w:divId w:val="309755264"/>
         <w:rPr>
           <w:rFonts w:ascii="Segoe UI" w:eastAsia="Times New Roman" w:hAnsi="Segoe UI" w:cs="Segoe UI"/>
           <w:color w:val="1E293B"/>
@@ -1748,7 +1748,7 @@
           <w:numId w:val="2"/>
         </w:numPr>
         <w:spacing w:before="100" w:beforeAutospacing="1" w:after="60"/>
-        <w:divId w:val="97339320"/>
+        <w:divId w:val="309755264"/>
         <w:rPr>
           <w:rFonts w:ascii="Segoe UI" w:eastAsia="Times New Roman" w:hAnsi="Segoe UI" w:cs="Segoe UI"/>
           <w:color w:val="1E293B"/>
@@ -1820,7 +1820,7 @@
           <w:numId w:val="2"/>
         </w:numPr>
         <w:spacing w:before="100" w:beforeAutospacing="1" w:after="60"/>
-        <w:divId w:val="97339320"/>
+        <w:divId w:val="309755264"/>
         <w:rPr>
           <w:rFonts w:ascii="Segoe UI" w:eastAsia="Times New Roman" w:hAnsi="Segoe UI" w:cs="Segoe UI"/>
           <w:color w:val="1E293B"/>
@@ -1875,7 +1875,7 @@
           <w:numId w:val="2"/>
         </w:numPr>
         <w:spacing w:before="100" w:beforeAutospacing="1" w:after="60"/>
-        <w:divId w:val="97339320"/>
+        <w:divId w:val="309755264"/>
         <w:rPr>
           <w:rFonts w:ascii="Segoe UI" w:eastAsia="Times New Roman" w:hAnsi="Segoe UI" w:cs="Segoe UI"/>
           <w:color w:val="1E293B"/>
@@ -1893,6 +1893,7 @@
           <w:szCs w:val="22"/>
           <w:lang w:val="es-ES"/>
         </w:rPr>
+        <w:lastRenderedPageBreak/>
         <w:t>Dirección IP Pública (IPv4):</w:t>
       </w:r>
       <w:r>
@@ -1910,7 +1911,7 @@
           <w:rStyle w:val="CdigoHTML"/>
           <w:lang w:val="es-ES"/>
         </w:rPr>
-        <w:t>20.124.68.142</w:t>
+        <w:t>68.211.136.184</w:t>
       </w:r>
       <w:r>
         <w:rPr>
@@ -1930,7 +1931,7 @@
           <w:numId w:val="2"/>
         </w:numPr>
         <w:spacing w:before="100" w:beforeAutospacing="1" w:after="60"/>
-        <w:divId w:val="97339320"/>
+        <w:divId w:val="309755264"/>
         <w:rPr>
           <w:rFonts w:ascii="Segoe UI" w:eastAsia="Times New Roman" w:hAnsi="Segoe UI" w:cs="Segoe UI"/>
           <w:color w:val="1E293B"/>
@@ -1971,18 +1972,17 @@
     <w:p>
       <w:pPr>
         <w:pStyle w:val="Ttulo3"/>
-        <w:divId w:val="97339320"/>
-        <w:rPr>
-          <w:rFonts w:ascii="Segoe UI" w:eastAsia="Times New Roman" w:hAnsi="Segoe UI" w:cs="Segoe UI"/>
-          <w:lang w:val="es-ES"/>
-        </w:rPr>
-      </w:pPr>
-      <w:r>
-        <w:rPr>
-          <w:rFonts w:ascii="Segoe UI" w:eastAsia="Times New Roman" w:hAnsi="Segoe UI" w:cs="Segoe UI"/>
-          <w:lang w:val="es-ES"/>
-        </w:rPr>
-        <w:lastRenderedPageBreak/>
+        <w:divId w:val="309755264"/>
+        <w:rPr>
+          <w:rFonts w:ascii="Segoe UI" w:eastAsia="Times New Roman" w:hAnsi="Segoe UI" w:cs="Segoe UI"/>
+          <w:lang w:val="es-ES"/>
+        </w:rPr>
+      </w:pPr>
+      <w:r>
+        <w:rPr>
+          <w:rFonts w:ascii="Segoe UI" w:eastAsia="Times New Roman" w:hAnsi="Segoe UI" w:cs="Segoe UI"/>
+          <w:lang w:val="es-ES"/>
+        </w:rPr>
         <w:t>3.2 Matriz de Reglas de Entrada (Inbound Security Rules)</w:t>
       </w:r>
     </w:p>
@@ -2008,7 +2008,7 @@
       </w:tblGrid>
       <w:tr>
         <w:trPr>
-          <w:divId w:val="97339320"/>
+          <w:divId w:val="309755264"/>
           <w:tblHeader/>
         </w:trPr>
         <w:tc>
@@ -2322,7 +2322,7 @@
       </w:tr>
       <w:tr>
         <w:trPr>
-          <w:divId w:val="97339320"/>
+          <w:divId w:val="309755264"/>
         </w:trPr>
         <w:tc>
           <w:tcPr>
@@ -2593,7 +2593,7 @@
       </w:tr>
       <w:tr>
         <w:trPr>
-          <w:divId w:val="97339320"/>
+          <w:divId w:val="309755264"/>
         </w:trPr>
         <w:tc>
           <w:tcPr>
@@ -2864,7 +2864,7 @@
       </w:tr>
       <w:tr>
         <w:trPr>
-          <w:divId w:val="97339320"/>
+          <w:divId w:val="309755264"/>
         </w:trPr>
         <w:tc>
           <w:tcPr>
@@ -3135,7 +3135,7 @@
       </w:tr>
       <w:tr>
         <w:trPr>
-          <w:divId w:val="97339320"/>
+          <w:divId w:val="309755264"/>
         </w:trPr>
         <w:tc>
           <w:tcPr>
@@ -3406,7 +3406,7 @@
       </w:tr>
       <w:tr>
         <w:trPr>
-          <w:divId w:val="97339320"/>
+          <w:divId w:val="309755264"/>
         </w:trPr>
         <w:tc>
           <w:tcPr>
@@ -3670,7 +3670,7 @@
                 <w:sz w:val="20"/>
                 <w:szCs w:val="20"/>
               </w:rPr>
-              <w:t xml:space="preserve">Bloqueo automático de cualquier puerto no </w:t>
+              <w:t xml:space="preserve">Bloqueo automático de </w:t>
             </w:r>
             <w:r>
               <w:rPr>
@@ -3680,7 +3680,7 @@
                 <w:szCs w:val="20"/>
               </w:rPr>
               <w:lastRenderedPageBreak/>
-              <w:t>autorizado explícitamente.</w:t>
+              <w:t>cualquier puerto no autorizado explícitamente.</w:t>
             </w:r>
           </w:p>
         </w:tc>
@@ -3690,7 +3690,7 @@
       <w:pPr>
         <w:shd w:val="clear" w:color="auto" w:fill="F0F9FF"/>
         <w:jc w:val="center"/>
-        <w:divId w:val="1205941209"/>
+        <w:divId w:val="1258517871"/>
         <w:rPr>
           <w:rFonts w:ascii="Segoe UI" w:eastAsia="Times New Roman" w:hAnsi="Segoe UI" w:cs="Segoe UI"/>
           <w:b/>
@@ -3717,7 +3717,7 @@
     </w:p>
     <w:p>
       <w:pPr>
-        <w:divId w:val="97339320"/>
+        <w:divId w:val="309755264"/>
         <w:rPr>
           <w:rFonts w:ascii="Segoe UI" w:eastAsia="Times New Roman" w:hAnsi="Segoe UI" w:cs="Segoe UI"/>
           <w:color w:val="1E293B"/>
@@ -3748,7 +3748,7 @@
     <w:p>
       <w:pPr>
         <w:pStyle w:val="Ttulo2"/>
-        <w:divId w:val="97339320"/>
+        <w:divId w:val="309755264"/>
         <w:rPr>
           <w:rFonts w:ascii="Segoe UI" w:eastAsia="Times New Roman" w:hAnsi="Segoe UI" w:cs="Segoe UI"/>
           <w:lang w:val="es-ES"/>
@@ -3765,7 +3765,7 @@
     <w:p>
       <w:pPr>
         <w:pStyle w:val="Ttulo3"/>
-        <w:divId w:val="97339320"/>
+        <w:divId w:val="309755264"/>
         <w:rPr>
           <w:rFonts w:ascii="Segoe UI" w:eastAsia="Times New Roman" w:hAnsi="Segoe UI" w:cs="Segoe UI"/>
           <w:lang w:val="es-ES"/>
@@ -3782,7 +3782,7 @@
     <w:p>
       <w:pPr>
         <w:pStyle w:val="NormalWeb"/>
-        <w:divId w:val="97339320"/>
+        <w:divId w:val="309755264"/>
         <w:rPr>
           <w:rFonts w:ascii="Segoe UI" w:hAnsi="Segoe UI" w:cs="Segoe UI"/>
           <w:color w:val="1E293B"/>
@@ -3805,22 +3805,22 @@
     <w:p>
       <w:pPr>
         <w:pStyle w:val="HTMLconformatoprevio"/>
-        <w:divId w:val="97339320"/>
-        <w:rPr>
-          <w:lang w:val="es-ES"/>
-        </w:rPr>
-      </w:pPr>
-      <w:r>
-        <w:rPr>
-          <w:lang w:val="es-ES"/>
-        </w:rPr>
-        <w:t>mstsc /v:20.124.68.142:3389</w:t>
+        <w:divId w:val="309755264"/>
+        <w:rPr>
+          <w:lang w:val="es-ES"/>
+        </w:rPr>
+      </w:pPr>
+      <w:r>
+        <w:rPr>
+          <w:lang w:val="es-ES"/>
+        </w:rPr>
+        <w:t>mstsc /v:68.211.136.184:3389</w:t>
       </w:r>
     </w:p>
     <w:p>
       <w:pPr>
         <w:pStyle w:val="NormalWeb"/>
-        <w:divId w:val="97339320"/>
+        <w:divId w:val="309755264"/>
         <w:rPr>
           <w:rFonts w:ascii="Segoe UI" w:hAnsi="Segoe UI" w:cs="Segoe UI"/>
           <w:color w:val="1E293B"/>
@@ -3843,7 +3843,7 @@
     <w:p>
       <w:pPr>
         <w:pStyle w:val="Ttulo3"/>
-        <w:divId w:val="97339320"/>
+        <w:divId w:val="309755264"/>
         <w:rPr>
           <w:rFonts w:ascii="Segoe UI" w:eastAsia="Times New Roman" w:hAnsi="Segoe UI" w:cs="Segoe UI"/>
           <w:lang w:val="es-ES"/>
@@ -3860,7 +3860,7 @@
     <w:p>
       <w:pPr>
         <w:pStyle w:val="NormalWeb"/>
-        <w:divId w:val="97339320"/>
+        <w:divId w:val="309755264"/>
         <w:rPr>
           <w:rFonts w:ascii="Segoe UI" w:hAnsi="Segoe UI" w:cs="Segoe UI"/>
           <w:color w:val="1E293B"/>
@@ -3883,7 +3883,7 @@
     <w:p>
       <w:pPr>
         <w:pStyle w:val="HTMLconformatoprevio"/>
-        <w:divId w:val="97339320"/>
+        <w:divId w:val="309755264"/>
         <w:rPr>
           <w:lang w:val="es-ES"/>
         </w:rPr>
@@ -3898,7 +3898,7 @@
     <w:p>
       <w:pPr>
         <w:pStyle w:val="NormalWeb"/>
-        <w:divId w:val="97339320"/>
+        <w:divId w:val="309755264"/>
         <w:rPr>
           <w:rFonts w:ascii="Segoe UI" w:hAnsi="Segoe UI" w:cs="Segoe UI"/>
           <w:color w:val="1E293B"/>
@@ -3921,7 +3921,7 @@
     <w:p>
       <w:pPr>
         <w:pStyle w:val="HTMLconformatoprevio"/>
-        <w:divId w:val="97339320"/>
+        <w:divId w:val="309755264"/>
         <w:rPr>
           <w:lang w:val="es-ES"/>
         </w:rPr>
@@ -3936,17 +3936,18 @@
     <w:p>
       <w:pPr>
         <w:pStyle w:val="Ttulo3"/>
-        <w:divId w:val="97339320"/>
-        <w:rPr>
-          <w:rFonts w:ascii="Segoe UI" w:eastAsia="Times New Roman" w:hAnsi="Segoe UI" w:cs="Segoe UI"/>
-          <w:lang w:val="es-ES"/>
-        </w:rPr>
-      </w:pPr>
-      <w:r>
-        <w:rPr>
-          <w:rFonts w:ascii="Segoe UI" w:eastAsia="Times New Roman" w:hAnsi="Segoe UI" w:cs="Segoe UI"/>
-          <w:lang w:val="es-ES"/>
-        </w:rPr>
+        <w:divId w:val="309755264"/>
+        <w:rPr>
+          <w:rFonts w:ascii="Segoe UI" w:eastAsia="Times New Roman" w:hAnsi="Segoe UI" w:cs="Segoe UI"/>
+          <w:lang w:val="es-ES"/>
+        </w:rPr>
+      </w:pPr>
+      <w:r>
+        <w:rPr>
+          <w:rFonts w:ascii="Segoe UI" w:eastAsia="Times New Roman" w:hAnsi="Segoe UI" w:cs="Segoe UI"/>
+          <w:lang w:val="es-ES"/>
+        </w:rPr>
+        <w:lastRenderedPageBreak/>
         <w:t>4.3 Configuración del Sitio Web y Proxy Inverso</w:t>
       </w:r>
     </w:p>
@@ -3957,7 +3958,7 @@
           <w:numId w:val="3"/>
         </w:numPr>
         <w:spacing w:before="100" w:beforeAutospacing="1" w:after="60"/>
-        <w:divId w:val="97339320"/>
+        <w:divId w:val="309755264"/>
         <w:rPr>
           <w:rFonts w:ascii="Segoe UI" w:eastAsia="Times New Roman" w:hAnsi="Segoe UI" w:cs="Segoe UI"/>
           <w:color w:val="1E293B"/>
@@ -3975,7 +3976,6 @@
           <w:szCs w:val="22"/>
           <w:lang w:val="es-ES"/>
         </w:rPr>
-        <w:lastRenderedPageBreak/>
         <w:t>Ruta Física:</w:t>
       </w:r>
       <w:r>
@@ -4013,7 +4013,7 @@
           <w:numId w:val="3"/>
         </w:numPr>
         <w:spacing w:before="100" w:beforeAutospacing="1" w:after="60"/>
-        <w:divId w:val="97339320"/>
+        <w:divId w:val="309755264"/>
         <w:rPr>
           <w:rFonts w:ascii="Segoe UI" w:eastAsia="Times New Roman" w:hAnsi="Segoe UI" w:cs="Segoe UI"/>
           <w:color w:val="1E293B"/>
@@ -4068,7 +4068,7 @@
           <w:numId w:val="3"/>
         </w:numPr>
         <w:spacing w:before="100" w:beforeAutospacing="1" w:after="60"/>
-        <w:divId w:val="97339320"/>
+        <w:divId w:val="309755264"/>
         <w:rPr>
           <w:rFonts w:ascii="Segoe UI" w:eastAsia="Times New Roman" w:hAnsi="Segoe UI" w:cs="Segoe UI"/>
           <w:color w:val="1E293B"/>
@@ -4103,7 +4103,7 @@
           <w:rStyle w:val="CdigoHTML"/>
           <w:lang w:val="es-ES"/>
         </w:rPr>
-        <w:t>aurasmartparking.eastus.cloudapp.azure.com</w:t>
+        <w:t>puntoalerce.chilecentral.cloudapp.azure.com</w:t>
       </w:r>
       <w:r>
         <w:rPr>
@@ -4120,7 +4120,7 @@
       <w:pPr>
         <w:shd w:val="clear" w:color="auto" w:fill="F0F9FF"/>
         <w:jc w:val="center"/>
-        <w:divId w:val="1615095906"/>
+        <w:divId w:val="484006427"/>
         <w:rPr>
           <w:rFonts w:ascii="Segoe UI" w:eastAsia="Times New Roman" w:hAnsi="Segoe UI" w:cs="Segoe UI"/>
           <w:b/>
@@ -4146,7 +4146,7 @@
     </w:p>
     <w:p>
       <w:pPr>
-        <w:divId w:val="97339320"/>
+        <w:divId w:val="309755264"/>
         <w:rPr>
           <w:rFonts w:ascii="Segoe UI" w:eastAsia="Times New Roman" w:hAnsi="Segoe UI" w:cs="Segoe UI"/>
           <w:color w:val="1E293B"/>
@@ -4177,7 +4177,7 @@
     <w:p>
       <w:pPr>
         <w:pStyle w:val="Ttulo2"/>
-        <w:divId w:val="97339320"/>
+        <w:divId w:val="309755264"/>
         <w:rPr>
           <w:rFonts w:ascii="Segoe UI" w:eastAsia="Times New Roman" w:hAnsi="Segoe UI" w:cs="Segoe UI"/>
           <w:lang w:val="es-ES"/>
@@ -4194,7 +4194,7 @@
     <w:p>
       <w:pPr>
         <w:pStyle w:val="NormalWeb"/>
-        <w:divId w:val="97339320"/>
+        <w:divId w:val="309755264"/>
         <w:rPr>
           <w:rFonts w:ascii="Segoe UI" w:hAnsi="Segoe UI" w:cs="Segoe UI"/>
           <w:color w:val="1E293B"/>
@@ -4227,7 +4227,7 @@
     <w:p>
       <w:pPr>
         <w:pStyle w:val="Ttulo3"/>
-        <w:divId w:val="97339320"/>
+        <w:divId w:val="309755264"/>
         <w:rPr>
           <w:rFonts w:ascii="Segoe UI" w:eastAsia="Times New Roman" w:hAnsi="Segoe UI" w:cs="Segoe UI"/>
           <w:lang w:val="es-ES"/>
@@ -4248,7 +4248,7 @@
           <w:numId w:val="4"/>
         </w:numPr>
         <w:spacing w:before="100" w:beforeAutospacing="1" w:after="60"/>
-        <w:divId w:val="97339320"/>
+        <w:divId w:val="309755264"/>
         <w:rPr>
           <w:rFonts w:ascii="Segoe UI" w:eastAsia="Times New Roman" w:hAnsi="Segoe UI" w:cs="Segoe UI"/>
           <w:color w:val="1E293B"/>
@@ -4283,7 +4283,7 @@
           <w:rStyle w:val="CdigoHTML"/>
           <w:lang w:val="es-ES"/>
         </w:rPr>
-        <w:t>aurasmartparking</w:t>
+        <w:t>puntoalerce</w:t>
       </w:r>
     </w:p>
     <w:p>
@@ -4293,7 +4293,7 @@
           <w:numId w:val="4"/>
         </w:numPr>
         <w:spacing w:before="100" w:beforeAutospacing="1" w:after="60"/>
-        <w:divId w:val="97339320"/>
+        <w:divId w:val="309755264"/>
         <w:rPr>
           <w:rFonts w:ascii="Segoe UI" w:eastAsia="Times New Roman" w:hAnsi="Segoe UI" w:cs="Segoe UI"/>
           <w:color w:val="1E293B"/>
@@ -4328,7 +4328,7 @@
           <w:rStyle w:val="CdigoHTML"/>
           <w:lang w:val="es-ES"/>
         </w:rPr>
-        <w:t>.eastus.cloudapp.azure.com</w:t>
+        <w:t>.chilecentral.cloudapp.azure.com</w:t>
       </w:r>
     </w:p>
     <w:p>
@@ -4338,7 +4338,7 @@
           <w:numId w:val="4"/>
         </w:numPr>
         <w:spacing w:before="100" w:beforeAutospacing="1" w:after="60"/>
-        <w:divId w:val="97339320"/>
+        <w:divId w:val="309755264"/>
         <w:rPr>
           <w:rFonts w:ascii="Segoe UI" w:eastAsia="Times New Roman" w:hAnsi="Segoe UI" w:cs="Segoe UI"/>
           <w:color w:val="1E293B"/>
@@ -4373,7 +4373,7 @@
           <w:rStyle w:val="CdigoHTML"/>
           <w:lang w:val="es-ES"/>
         </w:rPr>
-        <w:t>aurasmartparking.eastus.cloudapp.azure.com</w:t>
+        <w:t>puntoalerce.chilecentral.cloudapp.azure.com</w:t>
       </w:r>
     </w:p>
     <w:p>
@@ -4383,7 +4383,7 @@
           <w:numId w:val="4"/>
         </w:numPr>
         <w:spacing w:before="100" w:beforeAutospacing="1" w:after="60"/>
-        <w:divId w:val="97339320"/>
+        <w:divId w:val="309755264"/>
         <w:rPr>
           <w:rFonts w:ascii="Segoe UI" w:eastAsia="Times New Roman" w:hAnsi="Segoe UI" w:cs="Segoe UI"/>
           <w:color w:val="1E293B"/>
@@ -4418,13 +4418,13 @@
           <w:rStyle w:val="CdigoHTML"/>
           <w:lang w:val="es-ES"/>
         </w:rPr>
-        <w:t>20.124.68.142</w:t>
+        <w:t>68.211.136.184</w:t>
       </w:r>
     </w:p>
     <w:p>
       <w:pPr>
         <w:pStyle w:val="Ttulo3"/>
-        <w:divId w:val="97339320"/>
+        <w:divId w:val="309755264"/>
         <w:rPr>
           <w:rFonts w:ascii="Segoe UI" w:eastAsia="Times New Roman" w:hAnsi="Segoe UI" w:cs="Segoe UI"/>
           <w:lang w:val="es-ES"/>
@@ -4441,7 +4441,7 @@
     <w:p>
       <w:pPr>
         <w:pStyle w:val="NormalWeb"/>
-        <w:divId w:val="97339320"/>
+        <w:divId w:val="309755264"/>
         <w:rPr>
           <w:rFonts w:ascii="Segoe UI" w:hAnsi="Segoe UI" w:cs="Segoe UI"/>
           <w:color w:val="1E293B"/>
@@ -4498,7 +4498,7 @@
     <w:p>
       <w:pPr>
         <w:pStyle w:val="HTMLconformatoprevio"/>
-        <w:divId w:val="97339320"/>
+        <w:divId w:val="309755264"/>
         <w:rPr>
           <w:lang w:val="es-ES"/>
         </w:rPr>
@@ -4507,22 +4507,22 @@
     <w:p>
       <w:pPr>
         <w:pStyle w:val="HTMLconformatoprevio"/>
-        <w:divId w:val="97339320"/>
-        <w:rPr>
-          <w:lang w:val="es-ES"/>
-        </w:rPr>
-      </w:pPr>
-      <w:r>
-        <w:rPr>
-          <w:lang w:val="es-ES"/>
-        </w:rPr>
-        <w:t>C:\&gt; nslookup aurasmartparking.eastus.cloudapp.azure.com</w:t>
+        <w:divId w:val="309755264"/>
+        <w:rPr>
+          <w:lang w:val="es-ES"/>
+        </w:rPr>
+      </w:pPr>
+      <w:r>
+        <w:rPr>
+          <w:lang w:val="es-ES"/>
+        </w:rPr>
+        <w:t>C:\&gt; nslookup puntoalerce.chilecentral.cloudapp.azure.com</w:t>
       </w:r>
     </w:p>
     <w:p>
       <w:pPr>
         <w:pStyle w:val="HTMLconformatoprevio"/>
-        <w:divId w:val="97339320"/>
+        <w:divId w:val="309755264"/>
         <w:rPr>
           <w:lang w:val="es-ES"/>
         </w:rPr>
@@ -4537,7 +4537,7 @@
     <w:p>
       <w:pPr>
         <w:pStyle w:val="HTMLconformatoprevio"/>
-        <w:divId w:val="97339320"/>
+        <w:divId w:val="309755264"/>
         <w:rPr>
           <w:lang w:val="es-ES"/>
         </w:rPr>
@@ -4552,7 +4552,7 @@
     <w:p>
       <w:pPr>
         <w:pStyle w:val="HTMLconformatoprevio"/>
-        <w:divId w:val="97339320"/>
+        <w:divId w:val="309755264"/>
         <w:rPr>
           <w:lang w:val="es-ES"/>
         </w:rPr>
@@ -4561,7 +4561,7 @@
     <w:p>
       <w:pPr>
         <w:pStyle w:val="HTMLconformatoprevio"/>
-        <w:divId w:val="97339320"/>
+        <w:divId w:val="309755264"/>
         <w:rPr>
           <w:lang w:val="es-ES"/>
         </w:rPr>
@@ -4576,38 +4576,38 @@
     <w:p>
       <w:pPr>
         <w:pStyle w:val="HTMLconformatoprevio"/>
-        <w:divId w:val="97339320"/>
-        <w:rPr>
-          <w:lang w:val="es-ES"/>
-        </w:rPr>
-      </w:pPr>
-      <w:r>
-        <w:rPr>
-          <w:lang w:val="es-ES"/>
-        </w:rPr>
-        <w:t>Nombre:    aurasmartparking.eastus.cloudapp.azure.com</w:t>
+        <w:divId w:val="309755264"/>
+        <w:rPr>
+          <w:lang w:val="es-ES"/>
+        </w:rPr>
+      </w:pPr>
+      <w:r>
+        <w:rPr>
+          <w:lang w:val="es-ES"/>
+        </w:rPr>
+        <w:t>Nombre:    puntoalerce.chilecentral.cloudapp.azure.com</w:t>
       </w:r>
     </w:p>
     <w:p>
       <w:pPr>
         <w:pStyle w:val="HTMLconformatoprevio"/>
-        <w:divId w:val="97339320"/>
-        <w:rPr>
-          <w:lang w:val="es-ES"/>
-        </w:rPr>
-      </w:pPr>
-      <w:r>
-        <w:rPr>
-          <w:lang w:val="es-ES"/>
-        </w:rPr>
-        <w:t>Address:   20.124.68.142</w:t>
+        <w:divId w:val="309755264"/>
+        <w:rPr>
+          <w:lang w:val="es-ES"/>
+        </w:rPr>
+      </w:pPr>
+      <w:r>
+        <w:rPr>
+          <w:lang w:val="es-ES"/>
+        </w:rPr>
+        <w:t>Address:   68.211.136.184</w:t>
       </w:r>
     </w:p>
     <w:p>
       <w:pPr>
         <w:shd w:val="clear" w:color="auto" w:fill="F0F9FF"/>
         <w:jc w:val="center"/>
-        <w:divId w:val="148181724"/>
+        <w:divId w:val="1219123346"/>
         <w:rPr>
           <w:rFonts w:ascii="Segoe UI" w:eastAsia="Times New Roman" w:hAnsi="Segoe UI" w:cs="Segoe UI"/>
           <w:b/>
@@ -4633,7 +4633,7 @@
     </w:p>
     <w:p>
       <w:pPr>
-        <w:divId w:val="97339320"/>
+        <w:divId w:val="309755264"/>
         <w:rPr>
           <w:rFonts w:ascii="Segoe UI" w:eastAsia="Times New Roman" w:hAnsi="Segoe UI" w:cs="Segoe UI"/>
           <w:color w:val="1E293B"/>
@@ -4664,7 +4664,7 @@
     <w:p>
       <w:pPr>
         <w:pStyle w:val="Ttulo2"/>
-        <w:divId w:val="97339320"/>
+        <w:divId w:val="309755264"/>
         <w:rPr>
           <w:rFonts w:ascii="Segoe UI" w:eastAsia="Times New Roman" w:hAnsi="Segoe UI" w:cs="Segoe UI"/>
           <w:lang w:val="es-ES"/>
@@ -4681,7 +4681,7 @@
     <w:p>
       <w:pPr>
         <w:pStyle w:val="NormalWeb"/>
-        <w:divId w:val="97339320"/>
+        <w:divId w:val="309755264"/>
         <w:rPr>
           <w:rFonts w:ascii="Segoe UI" w:hAnsi="Segoe UI" w:cs="Segoe UI"/>
           <w:color w:val="1E293B"/>
@@ -4708,7 +4708,7 @@
           <w:numId w:val="5"/>
         </w:numPr>
         <w:spacing w:before="100" w:beforeAutospacing="1" w:after="60"/>
-        <w:divId w:val="97339320"/>
+        <w:divId w:val="309755264"/>
         <w:rPr>
           <w:rFonts w:ascii="Segoe UI" w:eastAsia="Times New Roman" w:hAnsi="Segoe UI" w:cs="Segoe UI"/>
           <w:color w:val="1E293B"/>
@@ -4747,7 +4747,7 @@
             <w:szCs w:val="22"/>
             <w:lang w:val="es-ES"/>
           </w:rPr>
-          <w:t>http://aurasmartparking.eastus.cloudapp.azure.com</w:t>
+          <w:t>http://puntoalerce.chilecentral.cloudapp.azure.com</w:t>
         </w:r>
       </w:hyperlink>
     </w:p>
@@ -4758,7 +4758,7 @@
           <w:numId w:val="5"/>
         </w:numPr>
         <w:spacing w:before="100" w:beforeAutospacing="1" w:after="60"/>
-        <w:divId w:val="97339320"/>
+        <w:divId w:val="309755264"/>
         <w:rPr>
           <w:rFonts w:ascii="Segoe UI" w:eastAsia="Times New Roman" w:hAnsi="Segoe UI" w:cs="Segoe UI"/>
           <w:color w:val="1E293B"/>
@@ -4838,7 +4838,7 @@
           <w:numId w:val="5"/>
         </w:numPr>
         <w:spacing w:before="100" w:beforeAutospacing="1" w:after="60"/>
-        <w:divId w:val="97339320"/>
+        <w:divId w:val="309755264"/>
         <w:rPr>
           <w:rFonts w:ascii="Segoe UI" w:eastAsia="Times New Roman" w:hAnsi="Segoe UI" w:cs="Segoe UI"/>
           <w:color w:val="1E293B"/>
@@ -4873,7 +4873,7 @@
       <w:pPr>
         <w:shd w:val="clear" w:color="auto" w:fill="F0F9FF"/>
         <w:jc w:val="center"/>
-        <w:divId w:val="895046329"/>
+        <w:divId w:val="1773284519"/>
         <w:rPr>
           <w:rFonts w:ascii="Segoe UI" w:eastAsia="Times New Roman" w:hAnsi="Segoe UI" w:cs="Segoe UI"/>
           <w:b/>
@@ -4894,12 +4894,12 @@
           <w:szCs w:val="22"/>
           <w:lang w:val="es-ES"/>
         </w:rPr>
-        <w:t xml:space="preserve">[PEGAR AQUÍ CAPTURA 5: Navegador web externo accediendo a http://aurasmartparking.eastus.cloudapp.azure.com mostrando el sitio activo] </w:t>
-      </w:r>
-    </w:p>
-    <w:p>
-      <w:pPr>
-        <w:divId w:val="97339320"/>
+        <w:t xml:space="preserve">[PEGAR AQUÍ CAPTURA 5: Navegador web externo accediendo a http://puntoalerce.chilecentral.cloudapp.azure.com mostrando el sitio activo] </w:t>
+      </w:r>
+    </w:p>
+    <w:p>
+      <w:pPr>
+        <w:divId w:val="309755264"/>
         <w:rPr>
           <w:rFonts w:ascii="Segoe UI" w:eastAsia="Times New Roman" w:hAnsi="Segoe UI" w:cs="Segoe UI"/>
           <w:color w:val="1E293B"/>
@@ -4930,7 +4930,7 @@
     <w:p>
       <w:pPr>
         <w:pStyle w:val="Ttulo2"/>
-        <w:divId w:val="97339320"/>
+        <w:divId w:val="309755264"/>
         <w:rPr>
           <w:rFonts w:ascii="Segoe UI" w:eastAsia="Times New Roman" w:hAnsi="Segoe UI" w:cs="Segoe UI"/>
           <w:lang w:val="es-ES"/>
@@ -4947,7 +4947,7 @@
     <w:p>
       <w:pPr>
         <w:pStyle w:val="NormalWeb"/>
-        <w:divId w:val="97339320"/>
+        <w:divId w:val="309755264"/>
         <w:rPr>
           <w:rFonts w:ascii="Segoe UI" w:hAnsi="Segoe UI" w:cs="Segoe UI"/>
           <w:color w:val="1E293B"/>
@@ -4970,7 +4970,7 @@
     <w:p>
       <w:pPr>
         <w:pStyle w:val="Ttulo3"/>
-        <w:divId w:val="97339320"/>
+        <w:divId w:val="309755264"/>
         <w:rPr>
           <w:rFonts w:ascii="Segoe UI" w:eastAsia="Times New Roman" w:hAnsi="Segoe UI" w:cs="Segoe UI"/>
           <w:lang w:val="es-ES"/>
@@ -4987,7 +4987,7 @@
     <w:p>
       <w:pPr>
         <w:pStyle w:val="NormalWeb"/>
-        <w:divId w:val="97339320"/>
+        <w:divId w:val="309755264"/>
         <w:rPr>
           <w:rFonts w:ascii="Segoe UI" w:hAnsi="Segoe UI" w:cs="Segoe UI"/>
           <w:color w:val="1E293B"/>
@@ -5077,7 +5077,7 @@
       <w:pPr>
         <w:shd w:val="clear" w:color="auto" w:fill="F0F9FF"/>
         <w:jc w:val="center"/>
-        <w:divId w:val="828131583"/>
+        <w:divId w:val="699624033"/>
         <w:rPr>
           <w:rFonts w:ascii="Segoe UI" w:eastAsia="Times New Roman" w:hAnsi="Segoe UI" w:cs="Segoe UI"/>
           <w:b/>
@@ -5103,7 +5103,7 @@
     </w:p>
     <w:p>
       <w:pPr>
-        <w:divId w:val="97339320"/>
+        <w:divId w:val="309755264"/>
         <w:rPr>
           <w:rFonts w:ascii="Segoe UI" w:eastAsia="Times New Roman" w:hAnsi="Segoe UI" w:cs="Segoe UI"/>
           <w:color w:val="1E293B"/>
@@ -5134,7 +5134,7 @@
     <w:p>
       <w:pPr>
         <w:pStyle w:val="Ttulo3"/>
-        <w:divId w:val="97339320"/>
+        <w:divId w:val="309755264"/>
         <w:rPr>
           <w:rFonts w:ascii="Segoe UI" w:eastAsia="Times New Roman" w:hAnsi="Segoe UI" w:cs="Segoe UI"/>
           <w:lang w:val="es-ES"/>
@@ -5151,7 +5151,7 @@
     <w:p>
       <w:pPr>
         <w:pStyle w:val="NormalWeb"/>
-        <w:divId w:val="97339320"/>
+        <w:divId w:val="309755264"/>
         <w:rPr>
           <w:rFonts w:ascii="Segoe UI" w:hAnsi="Segoe UI" w:cs="Segoe UI"/>
           <w:color w:val="1E293B"/>
@@ -5220,7 +5220,7 @@
       <w:pPr>
         <w:shd w:val="clear" w:color="auto" w:fill="F0F9FF"/>
         <w:jc w:val="center"/>
-        <w:divId w:val="2001234220"/>
+        <w:divId w:val="1084379517"/>
         <w:rPr>
           <w:rFonts w:ascii="Segoe UI" w:eastAsia="Times New Roman" w:hAnsi="Segoe UI" w:cs="Segoe UI"/>
           <w:b/>
@@ -5246,7 +5246,7 @@
     </w:p>
     <w:p>
       <w:pPr>
-        <w:divId w:val="97339320"/>
+        <w:divId w:val="309755264"/>
         <w:rPr>
           <w:rFonts w:ascii="Segoe UI" w:eastAsia="Times New Roman" w:hAnsi="Segoe UI" w:cs="Segoe UI"/>
           <w:color w:val="1E293B"/>
@@ -5277,7 +5277,7 @@
     <w:p>
       <w:pPr>
         <w:pStyle w:val="Ttulo3"/>
-        <w:divId w:val="97339320"/>
+        <w:divId w:val="309755264"/>
         <w:rPr>
           <w:rFonts w:ascii="Segoe UI" w:eastAsia="Times New Roman" w:hAnsi="Segoe UI" w:cs="Segoe UI"/>
           <w:lang w:val="es-ES"/>
@@ -5294,7 +5294,7 @@
     <w:p>
       <w:pPr>
         <w:pStyle w:val="NormalWeb"/>
-        <w:divId w:val="97339320"/>
+        <w:divId w:val="309755264"/>
         <w:rPr>
           <w:rFonts w:ascii="Segoe UI" w:hAnsi="Segoe UI" w:cs="Segoe UI"/>
           <w:color w:val="1E293B"/>
@@ -5432,7 +5432,7 @@
       <w:pPr>
         <w:shd w:val="clear" w:color="auto" w:fill="F0F9FF"/>
         <w:jc w:val="center"/>
-        <w:divId w:val="1987391899"/>
+        <w:divId w:val="1041397330"/>
         <w:rPr>
           <w:rFonts w:ascii="Segoe UI" w:eastAsia="Times New Roman" w:hAnsi="Segoe UI" w:cs="Segoe UI"/>
           <w:b/>
@@ -5458,7 +5458,7 @@
     </w:p>
     <w:p>
       <w:pPr>
-        <w:divId w:val="97339320"/>
+        <w:divId w:val="309755264"/>
         <w:rPr>
           <w:rFonts w:ascii="Segoe UI" w:eastAsia="Times New Roman" w:hAnsi="Segoe UI" w:cs="Segoe UI"/>
           <w:color w:val="1E293B"/>
@@ -5489,7 +5489,7 @@
     <w:p>
       <w:pPr>
         <w:pStyle w:val="Ttulo3"/>
-        <w:divId w:val="97339320"/>
+        <w:divId w:val="309755264"/>
         <w:rPr>
           <w:rFonts w:ascii="Segoe UI" w:eastAsia="Times New Roman" w:hAnsi="Segoe UI" w:cs="Segoe UI"/>
           <w:lang w:val="es-ES"/>
@@ -5506,7 +5506,7 @@
     <w:p>
       <w:pPr>
         <w:pStyle w:val="NormalWeb"/>
-        <w:divId w:val="97339320"/>
+        <w:divId w:val="309755264"/>
         <w:rPr>
           <w:rFonts w:ascii="Segoe UI" w:hAnsi="Segoe UI" w:cs="Segoe UI"/>
           <w:color w:val="1E293B"/>
@@ -5600,7 +5600,7 @@
       <w:pPr>
         <w:shd w:val="clear" w:color="auto" w:fill="F0F9FF"/>
         <w:jc w:val="center"/>
-        <w:divId w:val="189999395"/>
+        <w:divId w:val="1233201465"/>
         <w:rPr>
           <w:rFonts w:ascii="Segoe UI" w:eastAsia="Times New Roman" w:hAnsi="Segoe UI" w:cs="Segoe UI"/>
           <w:b/>
@@ -5626,7 +5626,7 @@
     </w:p>
     <w:p>
       <w:pPr>
-        <w:divId w:val="97339320"/>
+        <w:divId w:val="309755264"/>
         <w:rPr>
           <w:rFonts w:ascii="Segoe UI" w:eastAsia="Times New Roman" w:hAnsi="Segoe UI" w:cs="Segoe UI"/>
           <w:color w:val="1E293B"/>
@@ -5657,7 +5657,7 @@
     <w:p>
       <w:pPr>
         <w:pStyle w:val="Ttulo2"/>
-        <w:divId w:val="97339320"/>
+        <w:divId w:val="309755264"/>
         <w:rPr>
           <w:rFonts w:ascii="Segoe UI" w:eastAsia="Times New Roman" w:hAnsi="Segoe UI" w:cs="Segoe UI"/>
           <w:lang w:val="es-ES"/>
@@ -5674,7 +5674,7 @@
     <w:p>
       <w:pPr>
         <w:pStyle w:val="NormalWeb"/>
-        <w:divId w:val="97339320"/>
+        <w:divId w:val="309755264"/>
         <w:rPr>
           <w:rFonts w:ascii="Segoe UI" w:hAnsi="Segoe UI" w:cs="Segoe UI"/>
           <w:color w:val="1E293B"/>
@@ -5701,7 +5701,7 @@
           <w:numId w:val="6"/>
         </w:numPr>
         <w:spacing w:before="100" w:beforeAutospacing="1" w:after="60"/>
-        <w:divId w:val="97339320"/>
+        <w:divId w:val="309755264"/>
         <w:rPr>
           <w:rFonts w:ascii="Segoe UI" w:eastAsia="Times New Roman" w:hAnsi="Segoe UI" w:cs="Segoe UI"/>
           <w:color w:val="1E293B"/>
@@ -5751,7 +5751,7 @@
           <w:numId w:val="6"/>
         </w:numPr>
         <w:spacing w:before="100" w:beforeAutospacing="1" w:after="60"/>
-        <w:divId w:val="97339320"/>
+        <w:divId w:val="309755264"/>
         <w:rPr>
           <w:rFonts w:ascii="Segoe UI" w:eastAsia="Times New Roman" w:hAnsi="Segoe UI" w:cs="Segoe UI"/>
           <w:color w:val="1E293B"/>
@@ -5796,7 +5796,7 @@
           <w:numId w:val="6"/>
         </w:numPr>
         <w:spacing w:before="100" w:beforeAutospacing="1" w:after="60"/>
-        <w:divId w:val="97339320"/>
+        <w:divId w:val="309755264"/>
         <w:rPr>
           <w:rFonts w:ascii="Segoe UI" w:eastAsia="Times New Roman" w:hAnsi="Segoe UI" w:cs="Segoe UI"/>
           <w:color w:val="1E293B"/>
@@ -5881,10 +5881,8 @@
     <w:p>
       <w:pPr>
         <w:shd w:val="clear" w:color="auto" w:fill="F0F9FF"/>
-        <w:spacing w:before="300" w:after="120"/>
-        <w:ind w:left="600" w:right="600"/>
         <w:jc w:val="center"/>
-        <w:divId w:val="1466004119"/>
+        <w:divId w:val="1728990848"/>
         <w:rPr>
           <w:rFonts w:ascii="Segoe UI" w:eastAsia="Times New Roman" w:hAnsi="Segoe UI" w:cs="Segoe UI"/>
           <w:b/>
@@ -5910,8 +5908,7 @@
     </w:p>
     <w:p>
       <w:pPr>
-        <w:ind w:left="600" w:right="600"/>
-        <w:divId w:val="97339320"/>
+        <w:divId w:val="309755264"/>
         <w:rPr>
           <w:rFonts w:ascii="Segoe UI" w:eastAsia="Times New Roman" w:hAnsi="Segoe UI" w:cs="Segoe UI"/>
           <w:color w:val="1E293B"/>
@@ -5942,8 +5939,7 @@
     <w:p>
       <w:pPr>
         <w:pStyle w:val="Ttulo2"/>
-        <w:ind w:left="600" w:right="600"/>
-        <w:divId w:val="97339320"/>
+        <w:divId w:val="309755264"/>
         <w:rPr>
           <w:rFonts w:ascii="Segoe UI" w:eastAsia="Times New Roman" w:hAnsi="Segoe UI" w:cs="Segoe UI"/>
           <w:lang w:val="es-ES"/>
@@ -5960,8 +5956,7 @@
     <w:p>
       <w:pPr>
         <w:pStyle w:val="NormalWeb"/>
-        <w:ind w:left="600" w:right="600"/>
-        <w:divId w:val="97339320"/>
+        <w:divId w:val="309755264"/>
         <w:rPr>
           <w:rFonts w:ascii="Segoe UI" w:hAnsi="Segoe UI" w:cs="Segoe UI"/>
           <w:color w:val="1E293B"/>
@@ -6009,8 +6004,7 @@
           <w:numId w:val="7"/>
         </w:numPr>
         <w:spacing w:before="100" w:beforeAutospacing="1" w:after="60"/>
-        <w:ind w:left="1320" w:right="600"/>
-        <w:divId w:val="97339320"/>
+        <w:divId w:val="309755264"/>
         <w:rPr>
           <w:rFonts w:ascii="Segoe UI" w:eastAsia="Times New Roman" w:hAnsi="Segoe UI" w:cs="Segoe UI"/>
           <w:color w:val="1E293B"/>
@@ -6079,8 +6073,7 @@
           <w:numId w:val="7"/>
         </w:numPr>
         <w:spacing w:before="100" w:beforeAutospacing="1" w:after="60"/>
-        <w:ind w:left="1320" w:right="600"/>
-        <w:divId w:val="97339320"/>
+        <w:divId w:val="309755264"/>
         <w:rPr>
           <w:rFonts w:ascii="Segoe UI" w:eastAsia="Times New Roman" w:hAnsi="Segoe UI" w:cs="Segoe UI"/>
           <w:color w:val="1E293B"/>
@@ -6128,8 +6121,7 @@
           <w:numId w:val="7"/>
         </w:numPr>
         <w:spacing w:before="100" w:beforeAutospacing="1" w:after="60"/>
-        <w:ind w:left="1320" w:right="600"/>
-        <w:divId w:val="97339320"/>
+        <w:divId w:val="309755264"/>
         <w:rPr>
           <w:rFonts w:ascii="Segoe UI" w:eastAsia="Times New Roman" w:hAnsi="Segoe UI" w:cs="Segoe UI"/>
           <w:color w:val="1E293B"/>
@@ -6177,8 +6169,7 @@
           <w:numId w:val="7"/>
         </w:numPr>
         <w:spacing w:before="100" w:beforeAutospacing="1" w:after="60"/>
-        <w:ind w:left="1320" w:right="600"/>
-        <w:divId w:val="97339320"/>
+        <w:divId w:val="309755264"/>
         <w:rPr>
           <w:rFonts w:ascii="Segoe UI" w:eastAsia="Times New Roman" w:hAnsi="Segoe UI" w:cs="Segoe UI"/>
           <w:color w:val="1E293B"/>
@@ -6225,9 +6216,8 @@
           <w:ilvl w:val="0"/>
           <w:numId w:val="7"/>
         </w:numPr>
-        <w:spacing w:before="100" w:beforeAutospacing="1" w:after="600"/>
-        <w:ind w:left="1320" w:right="600"/>
-        <w:divId w:val="97339320"/>
+        <w:spacing w:before="100" w:beforeAutospacing="1" w:after="60"/>
+        <w:divId w:val="309755264"/>
         <w:rPr>
           <w:rFonts w:ascii="Segoe UI" w:eastAsia="Times New Roman" w:hAnsi="Segoe UI" w:cs="Segoe UI"/>
           <w:color w:val="1E293B"/>
@@ -6281,9 +6271,9 @@
 <file path=word/numbering.xml><?xml version="1.0" encoding="utf-8"?>
 <w:numbering xmlns:wpc="http://schemas.microsoft.com/office/word/2010/wordprocessingCanvas" xmlns:cx="http://schemas.microsoft.com/office/drawing/2014/chartex" xmlns:cx1="http://schemas.microsoft.com/office/drawing/2015/9/8/chartex" xmlns:cx2="http://schemas.microsoft.com/office/drawing/2015/10/21/chartex" xmlns:cx3="http://schemas.microsoft.com/office/drawing/2016/5/9/chartex" xmlns:cx4="http://schemas.microsoft.com/office/drawing/2016/5/10/chartex" xmlns:cx5="http://schemas.microsoft.com/office/drawing/2016/5/11/chartex" xmlns:cx6="http://schemas.microsoft.com/office/drawing/2016/5/12/chartex" xmlns:cx7="http://schemas.microsoft.com/office/drawing/2016/5/13/chartex" xmlns:cx8="http://schemas.microsoft.com/office/drawing/2016/5/14/chartex" xmlns:mc="http://schemas.openxmlformats.org/markup-compatibility/2006" xmlns:aink="http://schemas.microsoft.com/office/drawing/2016/ink" xmlns:am3d="http://schemas.microsoft.com/office/drawing/2017/model3d" xmlns:o="urn:schemas-microsoft-com:office:office" xmlns:oel="http://schemas.microsoft.com/office/2019/extlst" xmlns:r="http://schemas.openxmlformats.org/officeDocument/2006/relationships" xmlns:m="http://schemas.openxmlformats.org/officeDocument/2006/math" xmlns:v="urn:schemas-microsoft-com:vml" xmlns:wp14="http://schemas.microsoft.com/office/word/2010/wordprocessingDrawing" xmlns:wp="http://schemas.openxmlformats.org/drawingml/2006/wordprocessingDrawing" xmlns:w10="urn:schemas-microsoft-com:office:word" xmlns:w="http://schemas.openxmlformats.org/wordprocessingml/2006/main" xmlns:w14="http://schemas.microsoft.com/office/word/2010/wordml" xmlns:w15="http://schemas.microsoft.com/office/word/2012/wordml" xmlns:w16cex="http://schemas.microsoft.com/office/word/2018/wordml/cex" xmlns:w16cid="http://schemas.microsoft.com/office/word/2016/wordml/cid" xmlns:w16="http://schemas.microsoft.com/office/word/2018/wordml" xmlns:w16du="http://schemas.microsoft.com/office/word/2023/wordml/word16du" xmlns:w16sdtdh="http://schemas.microsoft.com/office/word/2020/wordml/sdtdatahash" xmlns:w16sdtfl="http://schemas.microsoft.com/office/word/2024/wordml/sdtformatlock" xmlns:w16se="http://schemas.microsoft.com/office/word/2015/wordml/symex" xmlns:wpg="http://schemas.microsoft.com/office/word/2010/wordprocessingGroup" xmlns:wpi="http://schemas.microsoft.com/office/word/2010/wordprocessingInk" xmlns:wne="http://schemas.microsoft.com/office/word/2006/wordml" xmlns:wps="http://schemas.microsoft.com/office/word/2010/wordprocessingShape" mc:Ignorable="w14 w15 w16se w16cid w16 w16cex w16sdtdh w16sdtfl w16du wp14">
   <w:abstractNum w:abstractNumId="0" w15:restartNumberingAfterBreak="0">
-    <w:nsid w:val="0A8B2238"/>
+    <w:nsid w:val="1E2946D3"/>
     <w:multiLevelType w:val="multilevel"/>
-    <w:tmpl w:val="F4A850A2"/>
+    <w:tmpl w:val="7C82E544"/>
     <w:lvl w:ilvl="0">
       <w:start w:val="1"/>
       <w:numFmt w:val="bullet"/>
@@ -6430,9 +6420,9 @@
     </w:lvl>
   </w:abstractNum>
   <w:abstractNum w:abstractNumId="1" w15:restartNumberingAfterBreak="0">
-    <w:nsid w:val="1DC958B0"/>
+    <w:nsid w:val="37F44A91"/>
     <w:multiLevelType w:val="multilevel"/>
-    <w:tmpl w:val="49FA84C8"/>
+    <w:tmpl w:val="C6DEC544"/>
     <w:lvl w:ilvl="0">
       <w:start w:val="1"/>
       <w:numFmt w:val="bullet"/>
@@ -6579,9 +6569,122 @@
     </w:lvl>
   </w:abstractNum>
   <w:abstractNum w:abstractNumId="2" w15:restartNumberingAfterBreak="0">
-    <w:nsid w:val="235234C2"/>
+    <w:nsid w:val="408164AA"/>
     <w:multiLevelType w:val="multilevel"/>
-    <w:tmpl w:val="B0AE87CC"/>
+    <w:tmpl w:val="53DA48EC"/>
+    <w:lvl w:ilvl="0">
+      <w:start w:val="1"/>
+      <w:numFmt w:val="decimal"/>
+      <w:lvlText w:val="%1."/>
+      <w:lvlJc w:val="left"/>
+      <w:pPr>
+        <w:tabs>
+          <w:tab w:val="num" w:pos="720"/>
+        </w:tabs>
+        <w:ind w:left="720" w:hanging="360"/>
+      </w:pPr>
+    </w:lvl>
+    <w:lvl w:ilvl="1" w:tentative="1">
+      <w:start w:val="1"/>
+      <w:numFmt w:val="decimal"/>
+      <w:lvlText w:val="%2."/>
+      <w:lvlJc w:val="left"/>
+      <w:pPr>
+        <w:tabs>
+          <w:tab w:val="num" w:pos="1440"/>
+        </w:tabs>
+        <w:ind w:left="1440" w:hanging="360"/>
+      </w:pPr>
+    </w:lvl>
+    <w:lvl w:ilvl="2" w:tentative="1">
+      <w:start w:val="1"/>
+      <w:numFmt w:val="decimal"/>
+      <w:lvlText w:val="%3."/>
+      <w:lvlJc w:val="left"/>
+      <w:pPr>
+        <w:tabs>
+          <w:tab w:val="num" w:pos="2160"/>
+        </w:tabs>
+        <w:ind w:left="2160" w:hanging="360"/>
+      </w:pPr>
+    </w:lvl>
+    <w:lvl w:ilvl="3" w:tentative="1">
+      <w:start w:val="1"/>
+      <w:numFmt w:val="decimal"/>
+      <w:lvlText w:val="%4."/>
+      <w:lvlJc w:val="left"/>
+      <w:pPr>
+        <w:tabs>
+          <w:tab w:val="num" w:pos="2880"/>
+        </w:tabs>
+        <w:ind w:left="2880" w:hanging="360"/>
+      </w:pPr>
+    </w:lvl>
+    <w:lvl w:ilvl="4" w:tentative="1">
+      <w:start w:val="1"/>
+      <w:numFmt w:val="decimal"/>
+      <w:lvlText w:val="%5."/>
+      <w:lvlJc w:val="left"/>
+      <w:pPr>
+        <w:tabs>
+          <w:tab w:val="num" w:pos="3600"/>
+        </w:tabs>
+        <w:ind w:left="3600" w:hanging="360"/>
+      </w:pPr>
+    </w:lvl>
+    <w:lvl w:ilvl="5" w:tentative="1">
+      <w:start w:val="1"/>
+      <w:numFmt w:val="decimal"/>
+      <w:lvlText w:val="%6."/>
+      <w:lvlJc w:val="left"/>
+      <w:pPr>
+        <w:tabs>
+          <w:tab w:val="num" w:pos="4320"/>
+        </w:tabs>
+        <w:ind w:left="4320" w:hanging="360"/>
+      </w:pPr>
+    </w:lvl>
+    <w:lvl w:ilvl="6" w:tentative="1">
+      <w:start w:val="1"/>
+      <w:numFmt w:val="decimal"/>
+      <w:lvlText w:val="%7."/>
+      <w:lvlJc w:val="left"/>
+      <w:pPr>
+        <w:tabs>
+          <w:tab w:val="num" w:pos="5040"/>
+        </w:tabs>
+        <w:ind w:left="5040" w:hanging="360"/>
+      </w:pPr>
+    </w:lvl>
+    <w:lvl w:ilvl="7" w:tentative="1">
+      <w:start w:val="1"/>
+      <w:numFmt w:val="decimal"/>
+      <w:lvlText w:val="%8."/>
+      <w:lvlJc w:val="left"/>
+      <w:pPr>
+        <w:tabs>
+          <w:tab w:val="num" w:pos="5760"/>
+        </w:tabs>
+        <w:ind w:left="5760" w:hanging="360"/>
+      </w:pPr>
+    </w:lvl>
+    <w:lvl w:ilvl="8" w:tentative="1">
+      <w:start w:val="1"/>
+      <w:numFmt w:val="decimal"/>
+      <w:lvlText w:val="%9."/>
+      <w:lvlJc w:val="left"/>
+      <w:pPr>
+        <w:tabs>
+          <w:tab w:val="num" w:pos="6480"/>
+        </w:tabs>
+        <w:ind w:left="6480" w:hanging="360"/>
+      </w:pPr>
+    </w:lvl>
+  </w:abstractNum>
+  <w:abstractNum w:abstractNumId="3" w15:restartNumberingAfterBreak="0">
+    <w:nsid w:val="40F6630E"/>
+    <w:multiLevelType w:val="multilevel"/>
+    <w:tmpl w:val="962CBA48"/>
     <w:lvl w:ilvl="0">
       <w:start w:val="1"/>
       <w:numFmt w:val="bullet"/>
@@ -6727,123 +6830,10 @@
       </w:rPr>
     </w:lvl>
   </w:abstractNum>
-  <w:abstractNum w:abstractNumId="3" w15:restartNumberingAfterBreak="0">
-    <w:nsid w:val="29FF4FB4"/>
+  <w:abstractNum w:abstractNumId="4" w15:restartNumberingAfterBreak="0">
+    <w:nsid w:val="517125FF"/>
     <w:multiLevelType w:val="multilevel"/>
-    <w:tmpl w:val="D18C8E48"/>
-    <w:lvl w:ilvl="0">
-      <w:start w:val="1"/>
-      <w:numFmt w:val="decimal"/>
-      <w:lvlText w:val="%1."/>
-      <w:lvlJc w:val="left"/>
-      <w:pPr>
-        <w:tabs>
-          <w:tab w:val="num" w:pos="720"/>
-        </w:tabs>
-        <w:ind w:left="720" w:hanging="360"/>
-      </w:pPr>
-    </w:lvl>
-    <w:lvl w:ilvl="1" w:tentative="1">
-      <w:start w:val="1"/>
-      <w:numFmt w:val="decimal"/>
-      <w:lvlText w:val="%2."/>
-      <w:lvlJc w:val="left"/>
-      <w:pPr>
-        <w:tabs>
-          <w:tab w:val="num" w:pos="1440"/>
-        </w:tabs>
-        <w:ind w:left="1440" w:hanging="360"/>
-      </w:pPr>
-    </w:lvl>
-    <w:lvl w:ilvl="2" w:tentative="1">
-      <w:start w:val="1"/>
-      <w:numFmt w:val="decimal"/>
-      <w:lvlText w:val="%3."/>
-      <w:lvlJc w:val="left"/>
-      <w:pPr>
-        <w:tabs>
-          <w:tab w:val="num" w:pos="2160"/>
-        </w:tabs>
-        <w:ind w:left="2160" w:hanging="360"/>
-      </w:pPr>
-    </w:lvl>
-    <w:lvl w:ilvl="3" w:tentative="1">
-      <w:start w:val="1"/>
-      <w:numFmt w:val="decimal"/>
-      <w:lvlText w:val="%4."/>
-      <w:lvlJc w:val="left"/>
-      <w:pPr>
-        <w:tabs>
-          <w:tab w:val="num" w:pos="2880"/>
-        </w:tabs>
-        <w:ind w:left="2880" w:hanging="360"/>
-      </w:pPr>
-    </w:lvl>
-    <w:lvl w:ilvl="4" w:tentative="1">
-      <w:start w:val="1"/>
-      <w:numFmt w:val="decimal"/>
-      <w:lvlText w:val="%5."/>
-      <w:lvlJc w:val="left"/>
-      <w:pPr>
-        <w:tabs>
-          <w:tab w:val="num" w:pos="3600"/>
-        </w:tabs>
-        <w:ind w:left="3600" w:hanging="360"/>
-      </w:pPr>
-    </w:lvl>
-    <w:lvl w:ilvl="5" w:tentative="1">
-      <w:start w:val="1"/>
-      <w:numFmt w:val="decimal"/>
-      <w:lvlText w:val="%6."/>
-      <w:lvlJc w:val="left"/>
-      <w:pPr>
-        <w:tabs>
-          <w:tab w:val="num" w:pos="4320"/>
-        </w:tabs>
-        <w:ind w:left="4320" w:hanging="360"/>
-      </w:pPr>
-    </w:lvl>
-    <w:lvl w:ilvl="6" w:tentative="1">
-      <w:start w:val="1"/>
-      <w:numFmt w:val="decimal"/>
-      <w:lvlText w:val="%7."/>
-      <w:lvlJc w:val="left"/>
-      <w:pPr>
-        <w:tabs>
-          <w:tab w:val="num" w:pos="5040"/>
-        </w:tabs>
-        <w:ind w:left="5040" w:hanging="360"/>
-      </w:pPr>
-    </w:lvl>
-    <w:lvl w:ilvl="7" w:tentative="1">
-      <w:start w:val="1"/>
-      <w:numFmt w:val="decimal"/>
-      <w:lvlText w:val="%8."/>
-      <w:lvlJc w:val="left"/>
-      <w:pPr>
-        <w:tabs>
-          <w:tab w:val="num" w:pos="5760"/>
-        </w:tabs>
-        <w:ind w:left="5760" w:hanging="360"/>
-      </w:pPr>
-    </w:lvl>
-    <w:lvl w:ilvl="8" w:tentative="1">
-      <w:start w:val="1"/>
-      <w:numFmt w:val="decimal"/>
-      <w:lvlText w:val="%9."/>
-      <w:lvlJc w:val="left"/>
-      <w:pPr>
-        <w:tabs>
-          <w:tab w:val="num" w:pos="6480"/>
-        </w:tabs>
-        <w:ind w:left="6480" w:hanging="360"/>
-      </w:pPr>
-    </w:lvl>
-  </w:abstractNum>
-  <w:abstractNum w:abstractNumId="4" w15:restartNumberingAfterBreak="0">
-    <w:nsid w:val="38B0663C"/>
-    <w:multiLevelType w:val="multilevel"/>
-    <w:tmpl w:val="B768B440"/>
+    <w:tmpl w:val="CBCE1396"/>
     <w:lvl w:ilvl="0">
       <w:start w:val="1"/>
       <w:numFmt w:val="bullet"/>
@@ -6990,9 +6980,9 @@
     </w:lvl>
   </w:abstractNum>
   <w:abstractNum w:abstractNumId="5" w15:restartNumberingAfterBreak="0">
-    <w:nsid w:val="3B863A9B"/>
+    <w:nsid w:val="758E1E10"/>
     <w:multiLevelType w:val="multilevel"/>
-    <w:tmpl w:val="299CB496"/>
+    <w:tmpl w:val="F300EB5C"/>
     <w:lvl w:ilvl="0">
       <w:start w:val="1"/>
       <w:numFmt w:val="bullet"/>
@@ -7139,9 +7129,9 @@
     </w:lvl>
   </w:abstractNum>
   <w:abstractNum w:abstractNumId="6" w15:restartNumberingAfterBreak="0">
-    <w:nsid w:val="3E4E7D40"/>
+    <w:nsid w:val="7FB23009"/>
     <w:multiLevelType w:val="multilevel"/>
-    <w:tmpl w:val="9C16717C"/>
+    <w:tmpl w:val="F9909F48"/>
     <w:lvl w:ilvl="0">
       <w:start w:val="1"/>
       <w:numFmt w:val="bullet"/>
@@ -7287,26 +7277,26 @@
       </w:rPr>
     </w:lvl>
   </w:abstractNum>
-  <w:num w:numId="1" w16cid:durableId="408775306">
+  <w:num w:numId="1" w16cid:durableId="772626115">
+    <w:abstractNumId w:val="1"/>
+  </w:num>
+  <w:num w:numId="2" w16cid:durableId="2091269203">
+    <w:abstractNumId w:val="3"/>
+  </w:num>
+  <w:num w:numId="3" w16cid:durableId="1860194092">
     <w:abstractNumId w:val="2"/>
   </w:num>
-  <w:num w:numId="2" w16cid:durableId="951284896">
+  <w:num w:numId="4" w16cid:durableId="1807819816">
     <w:abstractNumId w:val="4"/>
   </w:num>
-  <w:num w:numId="3" w16cid:durableId="1851219586">
-    <w:abstractNumId w:val="3"/>
-  </w:num>
-  <w:num w:numId="4" w16cid:durableId="1262493797">
-    <w:abstractNumId w:val="1"/>
-  </w:num>
-  <w:num w:numId="5" w16cid:durableId="1563909514">
-    <w:abstractNumId w:val="0"/>
-  </w:num>
-  <w:num w:numId="6" w16cid:durableId="884025238">
+  <w:num w:numId="5" w16cid:durableId="2021274586">
     <w:abstractNumId w:val="5"/>
   </w:num>
-  <w:num w:numId="7" w16cid:durableId="175847320">
+  <w:num w:numId="6" w16cid:durableId="149176913">
     <w:abstractNumId w:val="6"/>
+  </w:num>
+  <w:num w:numId="7" w16cid:durableId="2105761264">
+    <w:abstractNumId w:val="0"/>
   </w:num>
 </w:numbering>
 </file>

</xml_diff>